<commit_message>
README ordenado, T25 en puntos porcentuales (xx_script_base_historico ya estaba archivado)
Co-Authored-By: Claude Sonnet 5 <noreply@anthropic.com>
</commit_message>
<xml_diff>
--- a/4. RESULTADOS/06_tratamiento_continuo/T25_resumen_medidas_q5.docx
+++ b/4. RESULTADOS/06_tratamiento_continuo/T25_resumen_medidas_q5.docx
@@ -989,7 +989,7 @@
                 <w:szCs w:val="22"/>
                 <w:color w:val="000000"/>
               </w:rPr>
-              <w:t xml:space="preserve">0.01</w:t>
+              <w:t xml:space="preserve">1.11</w:t>
             </w:r>
           </w:p>
         </w:tc>
@@ -1044,7 +1044,7 @@
                 <w:szCs w:val="22"/>
                 <w:color w:val="000000"/>
               </w:rPr>
-              <w:t xml:space="preserve">0.01</w:t>
+              <w:t xml:space="preserve">1.38</w:t>
             </w:r>
           </w:p>
         </w:tc>
@@ -1654,7 +1654,7 @@
                 <w:szCs w:val="22"/>
                 <w:color w:val="000000"/>
               </w:rPr>
-              <w:t xml:space="preserve">0.01</w:t>
+              <w:t xml:space="preserve">1.07</w:t>
             </w:r>
           </w:p>
         </w:tc>
@@ -1709,7 +1709,7 @@
                 <w:szCs w:val="22"/>
                 <w:color w:val="000000"/>
               </w:rPr>
-              <w:t xml:space="preserve">0.01</w:t>
+              <w:t xml:space="preserve">1.18</w:t>
             </w:r>
           </w:p>
         </w:tc>
@@ -2319,7 +2319,7 @@
                 <w:szCs w:val="22"/>
                 <w:color w:val="000000"/>
               </w:rPr>
-              <w:t xml:space="preserve">0.02</w:t>
+              <w:t xml:space="preserve">1.74</w:t>
             </w:r>
           </w:p>
         </w:tc>
@@ -2374,7 +2374,7 @@
                 <w:szCs w:val="22"/>
                 <w:color w:val="000000"/>
               </w:rPr>
-              <w:t xml:space="preserve">0.02</w:t>
+              <w:t xml:space="preserve">2.33</w:t>
             </w:r>
           </w:p>
         </w:tc>
@@ -2984,7 +2984,7 @@
                 <w:szCs w:val="22"/>
                 <w:color w:val="000000"/>
               </w:rPr>
-              <w:t xml:space="preserve">0.02</w:t>
+              <w:t xml:space="preserve">1.59</w:t>
             </w:r>
           </w:p>
         </w:tc>
@@ -3039,7 +3039,7 @@
                 <w:szCs w:val="22"/>
                 <w:color w:val="000000"/>
               </w:rPr>
-              <w:t xml:space="preserve">0.02</w:t>
+              <w:t xml:space="preserve">1.68</w:t>
             </w:r>
           </w:p>
         </w:tc>
@@ -3649,7 +3649,7 @@
                 <w:szCs w:val="22"/>
                 <w:color w:val="000000"/>
               </w:rPr>
-              <w:t xml:space="preserve">0.02</w:t>
+              <w:t xml:space="preserve">1.51</w:t>
             </w:r>
           </w:p>
         </w:tc>
@@ -3704,7 +3704,7 @@
                 <w:szCs w:val="22"/>
                 <w:color w:val="000000"/>
               </w:rPr>
-              <w:t xml:space="preserve">0.02</w:t>
+              <w:t xml:space="preserve">1.67</w:t>
             </w:r>
           </w:p>
         </w:tc>
@@ -4314,7 +4314,7 @@
                 <w:szCs w:val="22"/>
                 <w:color w:val="000000"/>
               </w:rPr>
-              <w:t xml:space="preserve">0.02</w:t>
+              <w:t xml:space="preserve">2.11</w:t>
             </w:r>
           </w:p>
         </w:tc>
@@ -4369,7 +4369,7 @@
                 <w:szCs w:val="22"/>
                 <w:color w:val="000000"/>
               </w:rPr>
-              <w:t xml:space="preserve">0.02</w:t>
+              <w:t xml:space="preserve">2.00</w:t>
             </w:r>
           </w:p>
         </w:tc>

</xml_diff>